<commit_message>
Función de Ackley: Ejercicio 2
</commit_message>
<xml_diff>
--- a/Semana2.docx
+++ b/Semana2.docx
@@ -226,7 +226,21 @@
           <w:sz w:val="24"/>
           <w:szCs w:val="24"/>
         </w:rPr>
-        <w:t xml:space="preserve">En la clase del martes vimos cómo plantear un problema para un proyecto, comenzando por definir un título y explicar claramente el problema que se quiere resolver. Como actividad, el profesor nos pidió buscar de manera individual un anteproyecto para </w:t>
+        <w:t xml:space="preserve">En la clase del martes </w:t>
+      </w:r>
+      <w:r>
+        <w:rPr>
+          <w:sz w:val="24"/>
+          <w:szCs w:val="24"/>
+        </w:rPr>
+        <w:t>c</w:t>
+      </w:r>
+      <w:r>
+        <w:rPr>
+          <w:sz w:val="24"/>
+          <w:szCs w:val="24"/>
+        </w:rPr>
+        <w:t xml:space="preserve">omo actividad, el profesor nos pidió buscar de manera individual un anteproyecto para </w:t>
       </w:r>
       <w:r>
         <w:rPr>
@@ -234,16 +248,163 @@
           <w:szCs w:val="24"/>
         </w:rPr>
         <w:t xml:space="preserve">ir planteando </w:t>
+      </w:r>
+      <w:r>
+        <w:rPr>
+          <w:sz w:val="24"/>
+          <w:szCs w:val="24"/>
+        </w:rPr>
+        <w:t>qué tipo de proyecto podríamos realizar.</w:t>
+      </w:r>
+      <w:r>
+        <w:rPr>
+          <w:sz w:val="24"/>
+          <w:szCs w:val="24"/>
+        </w:rPr>
+        <w:t xml:space="preserve"> Por lo que nos dio unos minutos para pensar en un título y en un </w:t>
+      </w:r>
+      <w:r>
+        <w:rPr>
+          <w:sz w:val="24"/>
+          <w:szCs w:val="24"/>
+        </w:rPr>
+        <w:t>planteamiento del problema</w:t>
+      </w:r>
+      <w:r>
+        <w:rPr>
+          <w:sz w:val="24"/>
+          <w:szCs w:val="24"/>
+        </w:rPr>
+        <w:t xml:space="preserve"> que contenga técnicas de IA.</w:t>
+      </w:r>
+    </w:p>
+    <w:p>
+      <w:pPr>
+        <w:rPr>
+          <w:sz w:val="24"/>
+          <w:szCs w:val="24"/>
+        </w:rPr>
+      </w:pPr>
+    </w:p>
+    <w:p>
+      <w:pPr>
+        <w:rPr>
+          <w:b/>
+          <w:color w:val="1F3864" w:themeColor="accent5" w:themeShade="80"/>
+          <w:sz w:val="24"/>
+          <w:szCs w:val="24"/>
+        </w:rPr>
+      </w:pPr>
+      <w:r>
+        <w:rPr>
+          <w:b/>
+          <w:color w:val="1F3864" w:themeColor="accent5" w:themeShade="80"/>
+          <w:sz w:val="24"/>
+          <w:szCs w:val="24"/>
+        </w:rPr>
+        <w:t xml:space="preserve">Clase Miércoles 2 </w:t>
+      </w:r>
+    </w:p>
+    <w:p>
+      <w:pPr>
+        <w:rPr>
+          <w:sz w:val="24"/>
+          <w:szCs w:val="24"/>
+        </w:rPr>
+      </w:pPr>
+      <w:r>
+        <w:rPr>
+          <w:sz w:val="24"/>
+          <w:szCs w:val="24"/>
+        </w:rPr>
+        <w:t xml:space="preserve">Función de </w:t>
+      </w:r>
+      <w:proofErr w:type="spellStart"/>
+      <w:r>
+        <w:rPr>
+          <w:sz w:val="24"/>
+          <w:szCs w:val="24"/>
+        </w:rPr>
+        <w:t>Ackley</w:t>
+      </w:r>
+      <w:proofErr w:type="spellEnd"/>
+      <w:r>
+        <w:rPr>
+          <w:sz w:val="24"/>
+          <w:szCs w:val="24"/>
+        </w:rPr>
+        <w:t>, ejercicio 2</w:t>
+      </w:r>
+    </w:p>
+    <w:p>
+      <w:pPr>
+        <w:rPr>
+          <w:sz w:val="24"/>
+          <w:szCs w:val="24"/>
+        </w:rPr>
+      </w:pPr>
+      <w:r>
+        <w:rPr>
+          <w:sz w:val="24"/>
+          <w:szCs w:val="24"/>
+        </w:rPr>
+        <w:t xml:space="preserve">En la clase del miércoles continuamos trabajando con la función de </w:t>
+      </w:r>
+      <w:proofErr w:type="spellStart"/>
+      <w:r>
+        <w:rPr>
+          <w:sz w:val="24"/>
+          <w:szCs w:val="24"/>
+        </w:rPr>
+        <w:t>Ackley</w:t>
+      </w:r>
+      <w:proofErr w:type="spellEnd"/>
+      <w:r>
+        <w:rPr>
+          <w:sz w:val="24"/>
+          <w:szCs w:val="24"/>
+        </w:rPr>
+        <w:t xml:space="preserve">. El profesor nos explicó y resolvió con nosotros una segunda función de </w:t>
+      </w:r>
+      <w:proofErr w:type="spellStart"/>
+      <w:r>
+        <w:rPr>
+          <w:sz w:val="24"/>
+          <w:szCs w:val="24"/>
+        </w:rPr>
+        <w:t>Ackley</w:t>
+      </w:r>
+      <w:proofErr w:type="spellEnd"/>
+      <w:r>
+        <w:rPr>
+          <w:sz w:val="24"/>
+          <w:szCs w:val="24"/>
+        </w:rPr>
+        <w:t xml:space="preserve"> para comprender mejor el proce</w:t>
+      </w:r>
+      <w:r>
+        <w:rPr>
+          <w:sz w:val="24"/>
+          <w:szCs w:val="24"/>
+        </w:rPr>
+        <w:t xml:space="preserve">dimiento y cómo se realiza su </w:t>
+      </w:r>
+      <w:r>
+        <w:rPr>
+          <w:sz w:val="24"/>
+          <w:szCs w:val="24"/>
+        </w:rPr>
+        <w:t>solución</w:t>
+      </w:r>
+      <w:r>
+        <w:rPr>
+          <w:sz w:val="24"/>
+          <w:szCs w:val="24"/>
+        </w:rPr>
+        <w:t>.</w:t>
       </w:r>
       <w:bookmarkStart w:id="0" w:name="_GoBack"/>
       <w:bookmarkEnd w:id="0"/>
-      <w:r>
-        <w:rPr>
-          <w:sz w:val="24"/>
-          <w:szCs w:val="24"/>
-        </w:rPr>
-        <w:t>qué tipo de proyecto podríamos realizar.</w:t>
-      </w:r>
     </w:p>
     <w:sectPr>
       <w:pgSz w:w="12240" w:h="15840"/>

</xml_diff>